<commit_message>
feat: expand deck to full teaching depth (v4, 120 slides)
Port the White Belt concept-teaching engine (components.py + concepts.py)
into the non-WSQ build: per-concept teaching slides, DMAIC wheel, SIPOC,
fishbone, Pareto and waste-wheel diagrams for every phase — mirroring the
128-slide WSQ deck minus its 8 WSQ admin/assessment slides, replaced by
the How You'll Learn flow. v3 archived to courseware/archive/.

Co-Authored-By: Claude Fable 5 <noreply@anthropic.com>
</commit_message>
<xml_diff>
--- a/courseware/LG-Certified Lean Six Sigma White Belt (CLSSWB) Training.docx
+++ b/courseware/LG-Certified Lean Six Sigma White Belt (CLSSWB) Training.docx
@@ -179,7 +179,7 @@
           <w:color w:val="1F6FEB"/>
           <w:sz w:val="24"/>
         </w:rPr>
-        <w:t>Version 3</w:t>
+        <w:t>Version 4</w:t>
       </w:r>
     </w:p>
     <w:p>
@@ -439,6 +439,64 @@
                 <w:sz w:val="19"/>
               </w:rPr>
               <w:t>Released under course code C142 as a commercial one-day hands-on course. Schedule restructured so every DMAIC lab gains additional hands-on time and the day closes with a full course recap and Q&amp;A.</w:t>
+            </w:r>
+          </w:p>
+        </w:tc>
+        <w:tc>
+          <w:tcPr>
+            <w:tcW w:type="dxa" w:w="2160"/>
+          </w:tcPr>
+          <w:p>
+            <w:r/>
+            <w:r>
+              <w:rPr>
+                <w:sz w:val="19"/>
+              </w:rPr>
+              <w:t>Dr. Alfred Ang</w:t>
+            </w:r>
+          </w:p>
+        </w:tc>
+      </w:tr>
+      <w:tr>
+        <w:tc>
+          <w:tcPr>
+            <w:tcW w:type="dxa" w:w="2160"/>
+          </w:tcPr>
+          <w:p>
+            <w:r/>
+            <w:r>
+              <w:rPr>
+                <w:sz w:val="19"/>
+              </w:rPr>
+              <w:t>4</w:t>
+            </w:r>
+          </w:p>
+        </w:tc>
+        <w:tc>
+          <w:tcPr>
+            <w:tcW w:type="dxa" w:w="2160"/>
+          </w:tcPr>
+          <w:p>
+            <w:r/>
+            <w:r>
+              <w:rPr>
+                <w:sz w:val="19"/>
+              </w:rPr>
+              <w:t>21 July 2026</w:t>
+            </w:r>
+          </w:p>
+        </w:tc>
+        <w:tc>
+          <w:tcPr>
+            <w:tcW w:type="dxa" w:w="2160"/>
+          </w:tcPr>
+          <w:p>
+            <w:r/>
+            <w:r>
+              <w:rPr>
+                <w:sz w:val="19"/>
+              </w:rPr>
+              <w:t>Slide deck expanded to full teaching depth: per-concept teaching slides for Foundations and every DMAIC phase (worked examples, diagrams and phase recaps), matching the depth of the original White Belt trainer deck.</w:t>
             </w:r>
           </w:p>
         </w:tc>

</xml_diff>